<commit_message>
fix(cal): docx single spacing no closer than solid in the opening brief on the merits (fb-595.91)
LibreOffice sets a single (240 auto) line of TeX Gyre Schola 0.94 em high, a 12.2 pt pitch in 13 pt type, so the
docx failed DEF-FORM-004 on 90 pairs of cover, heading, footnote and table lines. Single spacing is now 271 auto,
13.77 pt, the typst template's single pitch.

Co-Authored-By: Claude Opus 5.5 <noreply@anthropic.com>
Gate: fb-595-91-a1 4ff767861e6c6a2cb2cfef1ea276050191b70f4b
</commit_message>
<xml_diff>
--- a/courts/ninth-circuit/california/state/supreme-court/opening-brief-on-the-merits/usage/OUTPUT-opening-brief-on-the-merits.docx
+++ b/courts/ninth-circuit/california/state/supreme-court/opening-brief-on-the-merits/usage/OUTPUT-opening-brief-on-the-merits.docx
@@ -4,7 +4,7 @@
   <w:body>
     <w:p>
       <w:pPr>
-        <w:spacing w:before="0" w:after="0" w:line="240" w:lineRule="auto"/>
+        <w:spacing w:before="0" w:after="0" w:line="271" w:lineRule="auto"/>
         <w:ind w:left="0" w:right="0" w:firstLine="0"/>
         <w:jc w:val="center"/>
       </w:pPr>
@@ -90,7 +90,7 @@
           </w:tcPr>
           <w:p>
             <w:pPr>
-              <w:spacing w:before="0" w:after="100" w:line="240" w:lineRule="auto"/>
+              <w:spacing w:before="0" w:after="100" w:line="271" w:lineRule="auto"/>
               <w:ind w:left="0" w:right="0" w:firstLine="0"/>
             </w:pPr>
             <w:r>
@@ -135,7 +135,7 @@
           </w:p>
           <w:p>
             <w:pPr>
-              <w:spacing w:before="0" w:after="100" w:line="240" w:lineRule="auto"/>
+              <w:spacing w:before="0" w:after="100" w:line="271" w:lineRule="auto"/>
               <w:ind w:left="1071" w:right="0" w:firstLine="0"/>
             </w:pPr>
             <w:r>
@@ -156,7 +156,7 @@
           </w:p>
           <w:p>
             <w:pPr>
-              <w:spacing w:before="24" w:after="124" w:line="240" w:lineRule="auto"/>
+              <w:spacing w:before="24" w:after="124" w:line="271" w:lineRule="auto"/>
               <w:ind w:left="1071" w:right="0" w:firstLine="0"/>
             </w:pPr>
             <w:r>
@@ -165,7 +165,7 @@
           </w:p>
           <w:p>
             <w:pPr>
-              <w:spacing w:before="0" w:after="100" w:line="240" w:lineRule="auto"/>
+              <w:spacing w:before="0" w:after="100" w:line="271" w:lineRule="auto"/>
               <w:ind w:left="0" w:right="0" w:firstLine="0"/>
             </w:pPr>
             <w:r>
@@ -180,7 +180,7 @@
           </w:p>
           <w:p>
             <w:pPr>
-              <w:spacing w:before="0" w:after="100" w:line="240" w:lineRule="auto"/>
+              <w:spacing w:before="0" w:after="100" w:line="271" w:lineRule="auto"/>
               <w:ind w:left="1071" w:right="0" w:firstLine="0"/>
             </w:pPr>
             <w:r>
@@ -210,7 +210,7 @@
           </w:tcPr>
           <w:p>
             <w:pPr>
-              <w:spacing w:before="0" w:after="100" w:line="240" w:lineRule="auto"/>
+              <w:spacing w:before="0" w:after="100" w:line="271" w:lineRule="auto"/>
               <w:ind w:left="0" w:right="0" w:firstLine="0"/>
             </w:pPr>
             <w:r>
@@ -222,7 +222,7 @@
           </w:p>
           <w:p>
             <w:pPr>
-              <w:spacing w:before="0" w:after="0" w:line="240" w:lineRule="auto"/>
+              <w:spacing w:before="0" w:after="0" w:line="271" w:lineRule="auto"/>
               <w:ind w:left="0" w:right="0" w:firstLine="0"/>
             </w:pPr>
             <w:r>
@@ -237,7 +237,7 @@
     </w:tbl>
     <w:p>
       <w:pPr>
-        <w:spacing w:before="312" w:after="0" w:line="240" w:lineRule="auto"/>
+        <w:spacing w:before="312" w:after="0" w:line="271" w:lineRule="auto"/>
         <w:ind w:left="0" w:right="0" w:firstLine="0"/>
         <w:jc w:val="center"/>
       </w:pPr>
@@ -331,7 +331,7 @@
     </w:p>
     <w:p>
       <w:pPr>
-        <w:spacing w:before="0" w:after="0" w:line="240" w:lineRule="auto"/>
+        <w:spacing w:before="0" w:after="0" w:line="271" w:lineRule="auto"/>
         <w:ind w:left="0" w:right="0" w:firstLine="0"/>
         <w:jc w:val="center"/>
       </w:pPr>
@@ -431,7 +431,7 @@
     </w:p>
     <w:p>
       <w:pPr>
-        <w:spacing w:before="0" w:after="0" w:line="240" w:lineRule="auto"/>
+        <w:spacing w:before="0" w:after="0" w:line="271" w:lineRule="auto"/>
         <w:ind w:left="0" w:right="0" w:firstLine="0"/>
         <w:jc w:val="center"/>
       </w:pPr>
@@ -444,7 +444,7 @@
     </w:p>
     <w:p>
       <w:pPr>
-        <w:spacing w:before="0" w:after="499" w:line="240" w:lineRule="auto"/>
+        <w:spacing w:before="0" w:after="499" w:line="271" w:lineRule="auto"/>
         <w:ind w:left="0" w:right="0" w:firstLine="0"/>
         <w:jc w:val="center"/>
       </w:pPr>
@@ -478,7 +478,7 @@
     </w:p>
     <w:p>
       <w:pPr>
-        <w:spacing w:before="0" w:after="499" w:line="240" w:lineRule="auto"/>
+        <w:spacing w:before="0" w:after="499" w:line="271" w:lineRule="auto"/>
         <w:ind w:left="0" w:right="0" w:firstLine="0"/>
         <w:jc w:val="center"/>
       </w:pPr>
@@ -558,7 +558,7 @@
     <w:p>
       <w:pPr>
         <w:keepNext/>
-        <w:spacing w:before="0" w:after="0" w:line="240" w:lineRule="auto"/>
+        <w:spacing w:before="0" w:after="0" w:line="271" w:lineRule="auto"/>
         <w:ind w:left="3960" w:right="0" w:firstLine="0"/>
       </w:pPr>
       <w:r>
@@ -580,7 +580,7 @@
     <w:p>
       <w:pPr>
         <w:keepNext/>
-        <w:spacing w:before="0" w:after="0" w:line="240" w:lineRule="auto"/>
+        <w:spacing w:before="0" w:after="0" w:line="271" w:lineRule="auto"/>
         <w:ind w:left="3960" w:right="0" w:firstLine="0"/>
       </w:pPr>
       <w:r>
@@ -602,7 +602,7 @@
     <w:p>
       <w:pPr>
         <w:keepNext/>
-        <w:spacing w:before="0" w:after="0" w:line="240" w:lineRule="auto"/>
+        <w:spacing w:before="0" w:after="0" w:line="271" w:lineRule="auto"/>
         <w:ind w:left="3960" w:right="0" w:firstLine="0"/>
       </w:pPr>
       <w:r>
@@ -636,7 +636,7 @@
     <w:p>
       <w:pPr>
         <w:keepNext/>
-        <w:spacing w:before="0" w:after="0" w:line="240" w:lineRule="auto"/>
+        <w:spacing w:before="0" w:after="0" w:line="271" w:lineRule="auto"/>
         <w:ind w:left="3960" w:right="0" w:firstLine="0"/>
       </w:pPr>
       <w:r>
@@ -664,7 +664,7 @@
     <w:p>
       <w:pPr>
         <w:keepNext/>
-        <w:spacing w:before="0" w:after="0" w:line="240" w:lineRule="auto"/>
+        <w:spacing w:before="0" w:after="0" w:line="271" w:lineRule="auto"/>
         <w:ind w:left="3960" w:right="0" w:firstLine="0"/>
       </w:pPr>
       <w:r>
@@ -680,7 +680,7 @@
     <w:p>
       <w:pPr>
         <w:keepNext/>
-        <w:spacing w:before="0" w:after="0" w:line="240" w:lineRule="auto"/>
+        <w:spacing w:before="0" w:after="0" w:line="271" w:lineRule="auto"/>
         <w:ind w:left="3960" w:right="0" w:firstLine="0"/>
       </w:pPr>
       <w:r>
@@ -690,7 +690,7 @@
     <w:p>
       <w:pPr>
         <w:keepNext/>
-        <w:spacing w:before="0" w:after="130" w:line="240" w:lineRule="auto"/>
+        <w:spacing w:before="0" w:after="130" w:line="271" w:lineRule="auto"/>
         <w:ind w:left="3960" w:right="0" w:firstLine="0"/>
       </w:pPr>
       <w:r>
@@ -711,7 +711,7 @@
     </w:p>
     <w:p>
       <w:pPr>
-        <w:spacing w:before="0" w:after="0" w:line="240" w:lineRule="auto"/>
+        <w:spacing w:before="0" w:after="0" w:line="271" w:lineRule="auto"/>
         <w:ind w:left="3960" w:right="0" w:firstLine="0"/>
       </w:pPr>
       <w:r>
@@ -783,7 +783,7 @@
         <w:pStyle w:val="Heading1"/>
         <w:keepNext/>
         <w:pageBreakBefore/>
-        <w:spacing w:before="0" w:after="260" w:line="240" w:lineRule="auto"/>
+        <w:spacing w:before="0" w:after="260" w:line="271" w:lineRule="auto"/>
         <w:ind w:left="0" w:right="0" w:firstLine="0"/>
         <w:jc w:val="center"/>
       </w:pPr>
@@ -799,7 +799,7 @@
     <w:p>
       <w:pPr>
         <w:keepNext/>
-        <w:spacing w:before="0" w:after="60" w:line="240" w:lineRule="auto"/>
+        <w:spacing w:before="0" w:after="60" w:line="271" w:lineRule="auto"/>
         <w:ind w:left="0" w:right="0" w:firstLine="0"/>
         <w:jc w:val="right"/>
       </w:pPr>
@@ -819,7 +819,7 @@
           <w:tab w:val="left" w:pos="720"/>
           <w:tab w:val="right" w:leader="dot" w:pos="7900"/>
         </w:tabs>
-        <w:spacing w:before="120" w:after="0" w:line="240" w:lineRule="auto"/>
+        <w:spacing w:before="120" w:after="0" w:line="271" w:lineRule="auto"/>
         <w:ind w:left="720" w:right="620" w:hanging="720"/>
       </w:pPr>
       <w:r>
@@ -845,7 +845,7 @@
           <w:tab w:val="left" w:pos="720"/>
           <w:tab w:val="right" w:leader="dot" w:pos="7900"/>
         </w:tabs>
-        <w:spacing w:before="120" w:after="0" w:line="240" w:lineRule="auto"/>
+        <w:spacing w:before="120" w:after="0" w:line="271" w:lineRule="auto"/>
         <w:ind w:left="720" w:right="620" w:hanging="720"/>
       </w:pPr>
       <w:r>
@@ -871,7 +871,7 @@
           <w:tab w:val="left" w:pos="720"/>
           <w:tab w:val="right" w:leader="dot" w:pos="7900"/>
         </w:tabs>
-        <w:spacing w:before="120" w:after="0" w:line="240" w:lineRule="auto"/>
+        <w:spacing w:before="120" w:after="0" w:line="271" w:lineRule="auto"/>
         <w:ind w:left="720" w:right="620" w:hanging="720"/>
       </w:pPr>
       <w:r>
@@ -897,7 +897,7 @@
           <w:tab w:val="left" w:pos="720"/>
           <w:tab w:val="right" w:leader="dot" w:pos="7900"/>
         </w:tabs>
-        <w:spacing w:before="120" w:after="0" w:line="240" w:lineRule="auto"/>
+        <w:spacing w:before="120" w:after="0" w:line="271" w:lineRule="auto"/>
         <w:ind w:left="720" w:right="620" w:hanging="720"/>
       </w:pPr>
       <w:r>
@@ -923,7 +923,7 @@
           <w:tab w:val="left" w:pos="720"/>
           <w:tab w:val="right" w:leader="dot" w:pos="7900"/>
         </w:tabs>
-        <w:spacing w:before="60" w:after="0" w:line="240" w:lineRule="auto"/>
+        <w:spacing w:before="60" w:after="0" w:line="271" w:lineRule="auto"/>
         <w:ind w:left="720" w:right="620" w:hanging="720"/>
       </w:pPr>
       <w:r>
@@ -952,7 +952,7 @@
           <w:tab w:val="left" w:pos="1440"/>
           <w:tab w:val="right" w:leader="dot" w:pos="7900"/>
         </w:tabs>
-        <w:spacing w:before="60" w:after="0" w:line="240" w:lineRule="auto"/>
+        <w:spacing w:before="60" w:after="0" w:line="271" w:lineRule="auto"/>
         <w:ind w:left="1440" w:right="620" w:hanging="720"/>
       </w:pPr>
       <w:r>
@@ -981,7 +981,7 @@
           <w:tab w:val="left" w:pos="1440"/>
           <w:tab w:val="right" w:leader="dot" w:pos="7900"/>
         </w:tabs>
-        <w:spacing w:before="60" w:after="0" w:line="240" w:lineRule="auto"/>
+        <w:spacing w:before="60" w:after="0" w:line="271" w:lineRule="auto"/>
         <w:ind w:left="1440" w:right="620" w:hanging="720"/>
       </w:pPr>
       <w:r>
@@ -1010,7 +1010,7 @@
           <w:tab w:val="left" w:pos="720"/>
           <w:tab w:val="right" w:leader="dot" w:pos="7900"/>
         </w:tabs>
-        <w:spacing w:before="120" w:after="0" w:line="240" w:lineRule="auto"/>
+        <w:spacing w:before="120" w:after="0" w:line="271" w:lineRule="auto"/>
         <w:ind w:left="720" w:right="620" w:hanging="720"/>
       </w:pPr>
       <w:r>
@@ -1026,7 +1026,7 @@
         <w:tab/>
       </w:r>
       <w:r>
-        <w:t xml:space="preserve">12</w:t>
+        <w:t xml:space="preserve">13</w:t>
       </w:r>
     </w:p>
     <w:p>
@@ -1034,7 +1034,7 @@
         <w:pStyle w:val="Heading1"/>
         <w:keepNext/>
         <w:pageBreakBefore/>
-        <w:spacing w:before="0" w:after="260" w:line="240" w:lineRule="auto"/>
+        <w:spacing w:before="0" w:after="260" w:line="271" w:lineRule="auto"/>
         <w:ind w:left="0" w:right="0" w:firstLine="0"/>
         <w:jc w:val="center"/>
       </w:pPr>
@@ -1053,7 +1053,7 @@
         <w:tabs>
           <w:tab w:val="right" w:pos="7900"/>
         </w:tabs>
-        <w:spacing w:before="260" w:after="40" w:line="240" w:lineRule="auto"/>
+        <w:spacing w:before="260" w:after="40" w:line="271" w:lineRule="auto"/>
         <w:ind w:left="0" w:right="0" w:firstLine="0"/>
       </w:pPr>
       <w:r>
@@ -1081,7 +1081,7 @@
         <w:tabs>
           <w:tab w:val="right" w:leader="dot" w:pos="7900"/>
         </w:tabs>
-        <w:spacing w:before="140" w:after="0" w:line="240" w:lineRule="auto"/>
+        <w:spacing w:before="140" w:after="0" w:line="271" w:lineRule="auto"/>
         <w:ind w:left="504" w:right="1120" w:hanging="504"/>
       </w:pPr>
       <w:r>
@@ -1176,7 +1176,7 @@
         <w:tabs>
           <w:tab w:val="right" w:leader="dot" w:pos="7900"/>
         </w:tabs>
-        <w:spacing w:before="140" w:after="0" w:line="240" w:lineRule="auto"/>
+        <w:spacing w:before="140" w:after="0" w:line="271" w:lineRule="auto"/>
         <w:ind w:left="504" w:right="1120" w:hanging="504"/>
       </w:pPr>
       <w:r>
@@ -1271,7 +1271,7 @@
         <w:tabs>
           <w:tab w:val="right" w:leader="dot" w:pos="7900"/>
         </w:tabs>
-        <w:spacing w:before="140" w:after="0" w:line="240" w:lineRule="auto"/>
+        <w:spacing w:before="140" w:after="0" w:line="271" w:lineRule="auto"/>
         <w:ind w:left="504" w:right="1120" w:hanging="504"/>
       </w:pPr>
       <w:r>
@@ -1352,7 +1352,7 @@
         <w:tabs>
           <w:tab w:val="right" w:leader="dot" w:pos="7900"/>
         </w:tabs>
-        <w:spacing w:before="140" w:after="0" w:line="240" w:lineRule="auto"/>
+        <w:spacing w:before="140" w:after="0" w:line="271" w:lineRule="auto"/>
         <w:ind w:left="504" w:right="1120" w:hanging="504"/>
       </w:pPr>
       <w:r>
@@ -1433,7 +1433,7 @@
         <w:tabs>
           <w:tab w:val="right" w:leader="dot" w:pos="7900"/>
         </w:tabs>
-        <w:spacing w:before="140" w:after="0" w:line="240" w:lineRule="auto"/>
+        <w:spacing w:before="140" w:after="0" w:line="271" w:lineRule="auto"/>
         <w:ind w:left="504" w:right="1120" w:hanging="504"/>
       </w:pPr>
       <w:r>
@@ -1584,7 +1584,7 @@
         <w:tabs>
           <w:tab w:val="right" w:leader="dot" w:pos="7900"/>
         </w:tabs>
-        <w:spacing w:before="140" w:after="0" w:line="240" w:lineRule="auto"/>
+        <w:spacing w:before="140" w:after="0" w:line="271" w:lineRule="auto"/>
         <w:ind w:left="504" w:right="1120" w:hanging="504"/>
       </w:pPr>
       <w:r>
@@ -1656,7 +1656,7 @@
         <w:tab/>
       </w:r>
       <w:r>
-        <w:t xml:space="preserve">9, 10, 11</w:t>
+        <w:t xml:space="preserve">10, 11</w:t>
       </w:r>
     </w:p>
     <w:p>
@@ -1665,7 +1665,7 @@
         <w:tabs>
           <w:tab w:val="right" w:leader="dot" w:pos="7900"/>
         </w:tabs>
-        <w:spacing w:before="140" w:after="0" w:line="240" w:lineRule="auto"/>
+        <w:spacing w:before="140" w:after="0" w:line="271" w:lineRule="auto"/>
         <w:ind w:left="504" w:right="1120" w:hanging="504"/>
       </w:pPr>
       <w:r>
@@ -1746,7 +1746,7 @@
         <w:tabs>
           <w:tab w:val="right" w:leader="dot" w:pos="7900"/>
         </w:tabs>
-        <w:spacing w:before="140" w:after="0" w:line="240" w:lineRule="auto"/>
+        <w:spacing w:before="140" w:after="0" w:line="271" w:lineRule="auto"/>
         <w:ind w:left="504" w:right="1120" w:hanging="504"/>
       </w:pPr>
       <w:r>
@@ -1827,7 +1827,7 @@
         <w:tabs>
           <w:tab w:val="right" w:leader="dot" w:pos="7900"/>
         </w:tabs>
-        <w:spacing w:before="140" w:after="0" w:line="240" w:lineRule="auto"/>
+        <w:spacing w:before="140" w:after="0" w:line="271" w:lineRule="auto"/>
         <w:ind w:left="504" w:right="1120" w:hanging="504"/>
       </w:pPr>
       <w:r>
@@ -1908,7 +1908,7 @@
         <w:tabs>
           <w:tab w:val="right" w:leader="dot" w:pos="7900"/>
         </w:tabs>
-        <w:spacing w:before="140" w:after="0" w:line="240" w:lineRule="auto"/>
+        <w:spacing w:before="140" w:after="0" w:line="271" w:lineRule="auto"/>
         <w:ind w:left="504" w:right="1120" w:hanging="504"/>
       </w:pPr>
       <w:r>
@@ -1989,7 +1989,7 @@
         <w:tabs>
           <w:tab w:val="right" w:leader="dot" w:pos="7900"/>
         </w:tabs>
-        <w:spacing w:before="140" w:after="0" w:line="240" w:lineRule="auto"/>
+        <w:spacing w:before="140" w:after="0" w:line="271" w:lineRule="auto"/>
         <w:ind w:left="504" w:right="1120" w:hanging="504"/>
       </w:pPr>
       <w:r>
@@ -2070,7 +2070,7 @@
         <w:tabs>
           <w:tab w:val="right" w:leader="dot" w:pos="7900"/>
         </w:tabs>
-        <w:spacing w:before="140" w:after="0" w:line="240" w:lineRule="auto"/>
+        <w:spacing w:before="140" w:after="0" w:line="271" w:lineRule="auto"/>
         <w:ind w:left="504" w:right="1120" w:hanging="504"/>
       </w:pPr>
       <w:r>
@@ -2151,7 +2151,7 @@
         <w:tabs>
           <w:tab w:val="right" w:leader="dot" w:pos="7900"/>
         </w:tabs>
-        <w:spacing w:before="140" w:after="0" w:line="240" w:lineRule="auto"/>
+        <w:spacing w:before="140" w:after="0" w:line="271" w:lineRule="auto"/>
         <w:ind w:left="504" w:right="1120" w:hanging="504"/>
       </w:pPr>
       <w:r>
@@ -2232,7 +2232,7 @@
         <w:tabs>
           <w:tab w:val="right" w:leader="dot" w:pos="7900"/>
         </w:tabs>
-        <w:spacing w:before="140" w:after="0" w:line="240" w:lineRule="auto"/>
+        <w:spacing w:before="140" w:after="0" w:line="271" w:lineRule="auto"/>
         <w:ind w:left="504" w:right="1120" w:hanging="504"/>
       </w:pPr>
       <w:r>
@@ -2313,7 +2313,7 @@
         <w:tabs>
           <w:tab w:val="right" w:pos="7900"/>
         </w:tabs>
-        <w:spacing w:before="360" w:after="40" w:line="240" w:lineRule="auto"/>
+        <w:spacing w:before="360" w:after="40" w:line="271" w:lineRule="auto"/>
         <w:ind w:left="0" w:right="0" w:firstLine="0"/>
       </w:pPr>
       <w:r>
@@ -2330,7 +2330,7 @@
         <w:tabs>
           <w:tab w:val="right" w:leader="dot" w:pos="7900"/>
         </w:tabs>
-        <w:spacing w:before="140" w:after="0" w:line="240" w:lineRule="auto"/>
+        <w:spacing w:before="140" w:after="0" w:line="271" w:lineRule="auto"/>
         <w:ind w:left="504" w:right="1120" w:hanging="504"/>
       </w:pPr>
       <w:r>
@@ -2385,7 +2385,7 @@
         <w:tabs>
           <w:tab w:val="right" w:pos="7900"/>
         </w:tabs>
-        <w:spacing w:before="360" w:after="40" w:line="240" w:lineRule="auto"/>
+        <w:spacing w:before="360" w:after="40" w:line="271" w:lineRule="auto"/>
         <w:ind w:left="0" w:right="0" w:firstLine="0"/>
       </w:pPr>
       <w:r>
@@ -2402,7 +2402,7 @@
         <w:tabs>
           <w:tab w:val="right" w:leader="dot" w:pos="7900"/>
         </w:tabs>
-        <w:spacing w:before="140" w:after="0" w:line="240" w:lineRule="auto"/>
+        <w:spacing w:before="140" w:after="0" w:line="271" w:lineRule="auto"/>
         <w:ind w:left="504" w:right="1120" w:hanging="504"/>
       </w:pPr>
       <w:r>
@@ -2445,7 +2445,7 @@
         <w:tabs>
           <w:tab w:val="right" w:leader="dot" w:pos="7900"/>
         </w:tabs>
-        <w:spacing w:before="140" w:after="0" w:line="240" w:lineRule="auto"/>
+        <w:spacing w:before="140" w:after="0" w:line="271" w:lineRule="auto"/>
         <w:ind w:left="504" w:right="1120" w:hanging="504"/>
       </w:pPr>
       <w:r>
@@ -2479,7 +2479,7 @@
         <w:tab/>
       </w:r>
       <w:r>
-        <w:t xml:space="preserve">6, 10, 11, 12</w:t>
+        <w:t xml:space="preserve">6, 10, 12</w:t>
       </w:r>
     </w:p>
     <w:p>
@@ -2488,7 +2488,7 @@
         <w:tabs>
           <w:tab w:val="right" w:leader="dot" w:pos="7900"/>
         </w:tabs>
-        <w:spacing w:before="140" w:after="0" w:line="240" w:lineRule="auto"/>
+        <w:spacing w:before="140" w:after="0" w:line="271" w:lineRule="auto"/>
         <w:ind w:left="504" w:right="1120" w:hanging="504"/>
       </w:pPr>
       <w:r>
@@ -2531,7 +2531,7 @@
         <w:tabs>
           <w:tab w:val="right" w:leader="dot" w:pos="7900"/>
         </w:tabs>
-        <w:spacing w:before="140" w:after="0" w:line="240" w:lineRule="auto"/>
+        <w:spacing w:before="140" w:after="0" w:line="271" w:lineRule="auto"/>
         <w:ind w:left="504" w:right="1120" w:hanging="504"/>
       </w:pPr>
       <w:r>
@@ -2574,7 +2574,7 @@
         <w:tabs>
           <w:tab w:val="right" w:pos="7900"/>
         </w:tabs>
-        <w:spacing w:before="360" w:after="40" w:line="240" w:lineRule="auto"/>
+        <w:spacing w:before="360" w:after="40" w:line="271" w:lineRule="auto"/>
         <w:ind w:left="0" w:right="0" w:firstLine="0"/>
       </w:pPr>
       <w:r>
@@ -2591,7 +2591,7 @@
         <w:tabs>
           <w:tab w:val="right" w:leader="dot" w:pos="7900"/>
         </w:tabs>
-        <w:spacing w:before="140" w:after="0" w:line="240" w:lineRule="auto"/>
+        <w:spacing w:before="140" w:after="0" w:line="271" w:lineRule="auto"/>
         <w:ind w:left="504" w:right="1120" w:hanging="504"/>
       </w:pPr>
       <w:r>
@@ -3591,7 +3591,7 @@
         <w:tabs>
           <w:tab w:val="left" w:pos="3600"/>
         </w:tabs>
-        <w:spacing w:before="360" w:after="0" w:line="240" w:lineRule="auto"/>
+        <w:spacing w:before="360" w:after="0" w:line="271" w:lineRule="auto"/>
         <w:ind w:left="0" w:right="0" w:firstLine="0"/>
       </w:pPr>
       <w:r>
@@ -3622,14 +3622,14 @@
     <w:p>
       <w:pPr>
         <w:keepNext/>
-        <w:spacing w:before="0" w:after="0" w:line="240" w:lineRule="auto"/>
+        <w:spacing w:before="0" w:after="0" w:line="271" w:lineRule="auto"/>
         <w:ind w:left="0" w:right="0" w:firstLine="0"/>
       </w:pPr>
     </w:p>
     <w:p>
       <w:pPr>
         <w:keepNext/>
-        <w:spacing w:before="0" w:after="0" w:line="240" w:lineRule="auto"/>
+        <w:spacing w:before="0" w:after="0" w:line="271" w:lineRule="auto"/>
         <w:ind w:left="3600" w:right="0" w:firstLine="0"/>
       </w:pPr>
       <w:r>
@@ -3642,7 +3642,7 @@
     <w:p>
       <w:pPr>
         <w:keepNext/>
-        <w:spacing w:before="0" w:after="0" w:line="240" w:lineRule="auto"/>
+        <w:spacing w:before="0" w:after="0" w:line="271" w:lineRule="auto"/>
         <w:ind w:left="3600" w:right="0" w:firstLine="0"/>
       </w:pPr>
       <w:r>
@@ -3657,7 +3657,7 @@
     </w:p>
     <w:p>
       <w:pPr>
-        <w:spacing w:before="0" w:after="0" w:line="240" w:lineRule="auto"/>
+        <w:spacing w:before="0" w:after="0" w:line="271" w:lineRule="auto"/>
         <w:ind w:left="3600" w:right="0" w:firstLine="0"/>
       </w:pPr>
       <w:r>
@@ -3729,7 +3729,7 @@
         <w:pStyle w:val="Heading1"/>
         <w:keepNext/>
         <w:pageBreakBefore/>
-        <w:spacing w:before="0" w:after="260" w:line="240" w:lineRule="auto"/>
+        <w:spacing w:before="0" w:after="260" w:line="271" w:lineRule="auto"/>
         <w:ind w:left="0" w:right="0" w:firstLine="0"/>
         <w:jc w:val="center"/>
       </w:pPr>
@@ -3744,7 +3744,7 @@
     </w:p>
     <w:p>
       <w:pPr>
-        <w:spacing w:before="0" w:after="0" w:line="240" w:lineRule="auto"/>
+        <w:spacing w:before="0" w:after="0" w:line="271" w:lineRule="auto"/>
         <w:ind w:left="0" w:right="0" w:firstLine="0"/>
       </w:pPr>
       <w:r>
@@ -3835,7 +3835,7 @@
         <w:tabs>
           <w:tab w:val="left" w:pos="3600"/>
         </w:tabs>
-        <w:spacing w:before="360" w:after="0" w:line="240" w:lineRule="auto"/>
+        <w:spacing w:before="360" w:after="0" w:line="271" w:lineRule="auto"/>
         <w:ind w:left="0" w:right="0" w:firstLine="0"/>
       </w:pPr>
       <w:r>
@@ -3866,14 +3866,14 @@
     <w:p>
       <w:pPr>
         <w:keepNext/>
-        <w:spacing w:before="0" w:after="0" w:line="240" w:lineRule="auto"/>
+        <w:spacing w:before="0" w:after="0" w:line="271" w:lineRule="auto"/>
         <w:ind w:left="0" w:right="0" w:firstLine="0"/>
       </w:pPr>
     </w:p>
     <w:p>
       <w:pPr>
         <w:keepNext/>
-        <w:spacing w:before="0" w:after="0" w:line="240" w:lineRule="auto"/>
+        <w:spacing w:before="0" w:after="0" w:line="271" w:lineRule="auto"/>
         <w:ind w:left="3600" w:right="0" w:firstLine="0"/>
       </w:pPr>
       <w:r>
@@ -3886,7 +3886,7 @@
     <w:p>
       <w:pPr>
         <w:keepNext/>
-        <w:spacing w:before="0" w:after="0" w:line="240" w:lineRule="auto"/>
+        <w:spacing w:before="0" w:after="0" w:line="271" w:lineRule="auto"/>
         <w:ind w:left="3600" w:right="0" w:firstLine="0"/>
       </w:pPr>
       <w:r>
@@ -3901,7 +3901,7 @@
     </w:p>
     <w:p>
       <w:pPr>
-        <w:spacing w:before="0" w:after="0" w:line="240" w:lineRule="auto"/>
+        <w:spacing w:before="0" w:after="0" w:line="271" w:lineRule="auto"/>
         <w:ind w:left="3600" w:right="0" w:firstLine="0"/>
       </w:pPr>
       <w:r>
@@ -3973,7 +3973,7 @@
         <w:pStyle w:val="Heading1"/>
         <w:keepNext/>
         <w:pageBreakBefore/>
-        <w:spacing w:before="0" w:after="260" w:line="240" w:lineRule="auto"/>
+        <w:spacing w:before="0" w:after="260" w:line="271" w:lineRule="auto"/>
         <w:ind w:left="0" w:right="0" w:firstLine="0"/>
         <w:jc w:val="center"/>
       </w:pPr>
@@ -3988,7 +3988,7 @@
     </w:p>
     <w:p>
       <w:pPr>
-        <w:spacing w:before="0" w:after="210" w:line="240" w:lineRule="auto"/>
+        <w:spacing w:before="0" w:after="210" w:line="271" w:lineRule="auto"/>
         <w:ind w:left="0" w:right="0" w:firstLine="0"/>
       </w:pPr>
       <w:r>
@@ -3997,7 +3997,7 @@
     </w:p>
     <w:p>
       <w:pPr>
-        <w:spacing w:before="0" w:after="210" w:line="240" w:lineRule="auto"/>
+        <w:spacing w:before="0" w:after="210" w:line="271" w:lineRule="auto"/>
         <w:ind w:left="0" w:right="0" w:firstLine="0"/>
       </w:pPr>
       <w:r>
@@ -4127,7 +4127,7 @@
     <w:p>
       <w:pPr>
         <w:keepLines/>
-        <w:spacing w:before="0" w:after="160" w:line="240" w:lineRule="auto"/>
+        <w:spacing w:before="0" w:after="160" w:line="271" w:lineRule="auto"/>
         <w:ind w:left="720" w:right="0" w:firstLine="0"/>
       </w:pPr>
       <w:r>
@@ -4200,7 +4200,7 @@
     <w:p>
       <w:pPr>
         <w:keepLines/>
-        <w:spacing w:before="0" w:after="160" w:line="240" w:lineRule="auto"/>
+        <w:spacing w:before="0" w:after="160" w:line="271" w:lineRule="auto"/>
         <w:ind w:left="720" w:right="0" w:firstLine="0"/>
       </w:pPr>
       <w:r>
@@ -4249,7 +4249,7 @@
     <w:p>
       <w:pPr>
         <w:keepLines/>
-        <w:spacing w:before="0" w:after="160" w:line="240" w:lineRule="auto"/>
+        <w:spacing w:before="0" w:after="160" w:line="271" w:lineRule="auto"/>
         <w:ind w:left="720" w:right="0" w:firstLine="0"/>
       </w:pPr>
       <w:r>
@@ -4298,7 +4298,7 @@
     <w:p>
       <w:pPr>
         <w:keepLines/>
-        <w:spacing w:before="0" w:after="160" w:line="240" w:lineRule="auto"/>
+        <w:spacing w:before="0" w:after="160" w:line="271" w:lineRule="auto"/>
         <w:ind w:left="720" w:right="0" w:firstLine="0"/>
       </w:pPr>
       <w:r>
@@ -4371,7 +4371,7 @@
     <w:p>
       <w:pPr>
         <w:keepNext/>
-        <w:spacing w:before="50" w:after="360" w:line="240" w:lineRule="auto"/>
+        <w:spacing w:before="50" w:after="360" w:line="271" w:lineRule="auto"/>
         <w:ind w:left="0" w:right="0" w:firstLine="0"/>
       </w:pPr>
       <w:r>
@@ -4417,7 +4417,7 @@
     <w:p>
       <w:pPr>
         <w:keepLines/>
-        <w:spacing w:before="0" w:after="0" w:line="240" w:lineRule="auto"/>
+        <w:spacing w:before="0" w:after="0" w:line="271" w:lineRule="auto"/>
         <w:ind w:left="3960" w:right="0" w:firstLine="0"/>
       </w:pPr>
       <w:r>
@@ -4717,7 +4717,7 @@
     </w:rPrDefault>
     <w:pPrDefault>
       <w:pPr>
-        <w:spacing w:before="0" w:after="0" w:line="240" w:lineRule="auto"/>
+        <w:spacing w:before="0" w:after="0" w:line="271" w:lineRule="auto"/>
       </w:pPr>
     </w:pPrDefault>
   </w:docDefaults>
@@ -4727,7 +4727,7 @@
     <w:qFormat/>
     <w:pPr>
       <w:widowControl/>
-      <w:spacing w:before="0" w:after="0" w:line="240" w:lineRule="auto"/>
+      <w:spacing w:before="0" w:after="0" w:line="271" w:lineRule="auto"/>
       <w:ind w:firstLine="0"/>
     </w:pPr>
     <w:rPr>
@@ -4902,7 +4902,7 @@
     <w:pPr>
       <w:keepNext/>
       <w:keepLines/>
-      <w:spacing w:before="312" w:after="260" w:line="240" w:lineRule="auto"/>
+      <w:spacing w:before="312" w:after="260" w:line="271" w:lineRule="auto"/>
       <w:ind w:firstLine="0"/>
       <w:jc w:val="center"/>
       <w:outlineLvl w:val="0"/>
@@ -4929,7 +4929,7 @@
       <w:tabs>
         <w:tab w:val="left" w:pos="720"/>
       </w:tabs>
-      <w:spacing w:before="260" w:after="208" w:line="240" w:lineRule="auto"/>
+      <w:spacing w:before="260" w:after="208" w:line="271" w:lineRule="auto"/>
       <w:ind w:left="720" w:hanging="720"/>
       <w:jc w:val="left"/>
       <w:outlineLvl w:val="1"/>
@@ -5200,7 +5200,7 @@
     <w:next w:val="BodyText"/>
     <w:qFormat/>
     <w:pPr>
-      <w:spacing w:before="260" w:after="260" w:line="240" w:lineRule="auto"/>
+      <w:spacing w:before="260" w:after="260" w:line="271" w:lineRule="auto"/>
       <w:ind w:left="720" w:right="720" w:firstLine="0"/>
     </w:pPr>
   </w:style>
@@ -5211,7 +5211,7 @@
     <w:uiPriority w:val="99"/>
     <w:unhideWhenUsed/>
     <w:pPr>
-      <w:spacing w:before="0" w:after="130" w:line="240" w:lineRule="auto"/>
+      <w:spacing w:before="0" w:after="130" w:line="271" w:lineRule="auto"/>
       <w:ind w:firstLine="0"/>
     </w:pPr>
     <w:rPr>
@@ -5372,7 +5372,7 @@
     <w:uiPriority w:val="99"/>
     <w:unhideWhenUsed/>
     <w:pPr>
-      <w:spacing w:after="0" w:line="240" w:lineRule="auto"/>
+      <w:spacing w:after="0" w:line="271" w:lineRule="auto"/>
       <w:ind w:firstLine="0"/>
       <w:jc w:val="center"/>
     </w:pPr>

</xml_diff>